<commit_message>
docs: incluindo arquivo para projeto final
</commit_message>
<xml_diff>
--- a/Práticas/Desenvolvimento de Software Integrado - DevOps - Guia Técnico de Entrega (Docker e Pipeline CI-CD).docx
+++ b/Práticas/Desenvolvimento de Software Integrado - DevOps - Guia Técnico de Entrega (Docker e Pipeline CI-CD).docx
@@ -585,6 +585,639 @@
         </w:tc>
       </w:tr>
     </w:tbl>
+    <w:p>
+      <w:pPr>
+        <w:spacing w:after="120"/>
+      </w:pPr>
+    </w:p>
+    <w:p>
+      <w:pPr>
+        <w:pStyle w:val="Heading3"/>
+        <w:spacing w:after="100" w:before="220"/>
+      </w:pPr>
+      <w:r>
+        <w:rPr>
+          <w:rFonts w:ascii="Calibri" w:cs="Calibri" w:eastAsia="Calibri" w:hAnsi="Calibri"/>
+          <w:b/>
+          <w:bCs/>
+          <w:color w:val="1B2A4A"/>
+          <w:sz w:val="22"/>
+          <w:szCs w:val="22"/>
+        </w:rPr>
+        <w:t xml:space="preserve">Onde isso entra na nota final</w:t>
+      </w:r>
+    </w:p>
+    <w:p>
+      <w:pPr>
+        <w:spacing w:after="160"/>
+      </w:pPr>
+      <w:r>
+        <w:rPr>
+          <w:rFonts w:ascii="Calibri" w:cs="Calibri" w:eastAsia="Calibri" w:hAnsi="Calibri"/>
+          <w:sz w:val="22"/>
+          <w:szCs w:val="22"/>
+        </w:rPr>
+        <w:t xml:space="preserve">Este guia é o padrão técnico de apenas 2 dos 6 critérios oficiais do Plano de Ensino — os pesos abaixo já são os pesos oficiais, não pesos deste documento, e não podem ser alterados:</w:t>
+      </w:r>
+    </w:p>
+    <w:tbl>
+      <w:tblPr>
+        <w:tblW w:type="dxa" w:w="9026"/>
+        <w:tblBorders>
+          <w:top w:val="single" w:color="auto" w:sz="4"/>
+          <w:left w:val="single" w:color="auto" w:sz="4"/>
+          <w:bottom w:val="single" w:color="auto" w:sz="4"/>
+          <w:right w:val="single" w:color="auto" w:sz="4"/>
+          <w:insideH w:val="single" w:color="auto" w:sz="4"/>
+          <w:insideV w:val="single" w:color="auto" w:sz="4"/>
+        </w:tblBorders>
+      </w:tblPr>
+      <w:tblGrid>
+        <w:gridCol w:w="1800"/>
+        <w:gridCol w:w="4800"/>
+        <w:gridCol w:w="2426"/>
+      </w:tblGrid>
+      <w:tr>
+        <w:trPr>
+          <w:tblHeader/>
+        </w:trPr>
+        <w:tc>
+          <w:tcPr>
+            <w:tcW w:type="dxa" w:w="1800"/>
+            <w:shd w:fill="1B2A4A" w:color="auto" w:val="clear"/>
+            <w:tcMar>
+              <w:top w:type="dxa" w:w="100"/>
+              <w:left w:type="dxa" w:w="120"/>
+              <w:bottom w:type="dxa" w:w="100"/>
+              <w:right w:type="dxa" w:w="120"/>
+            </w:tcMar>
+            <w:vAlign w:val="center"/>
+          </w:tcPr>
+          <w:p>
+            <w:r>
+              <w:rPr>
+                <w:rFonts w:ascii="Calibri" w:cs="Calibri" w:eastAsia="Calibri" w:hAnsi="Calibri"/>
+                <w:b/>
+                <w:bCs/>
+                <w:color w:val="FFFFFF"/>
+                <w:sz w:val="21"/>
+                <w:szCs w:val="21"/>
+              </w:rPr>
+              <w:t xml:space="preserve">Peso</w:t>
+            </w:r>
+          </w:p>
+        </w:tc>
+        <w:tc>
+          <w:tcPr>
+            <w:tcW w:type="dxa" w:w="4800"/>
+            <w:shd w:fill="1B2A4A" w:color="auto" w:val="clear"/>
+            <w:tcMar>
+              <w:top w:type="dxa" w:w="100"/>
+              <w:left w:type="dxa" w:w="120"/>
+              <w:bottom w:type="dxa" w:w="100"/>
+              <w:right w:type="dxa" w:w="120"/>
+            </w:tcMar>
+            <w:vAlign w:val="center"/>
+          </w:tcPr>
+          <w:p>
+            <w:r>
+              <w:rPr>
+                <w:rFonts w:ascii="Calibri" w:cs="Calibri" w:eastAsia="Calibri" w:hAnsi="Calibri"/>
+                <w:b/>
+                <w:bCs/>
+                <w:color w:val="FFFFFF"/>
+                <w:sz w:val="21"/>
+                <w:szCs w:val="21"/>
+              </w:rPr>
+              <w:t xml:space="preserve">Critério</w:t>
+            </w:r>
+          </w:p>
+        </w:tc>
+        <w:tc>
+          <w:tcPr>
+            <w:tcW w:type="dxa" w:w="2426"/>
+            <w:shd w:fill="1B2A4A" w:color="auto" w:val="clear"/>
+            <w:tcMar>
+              <w:top w:type="dxa" w:w="100"/>
+              <w:left w:type="dxa" w:w="120"/>
+              <w:bottom w:type="dxa" w:w="100"/>
+              <w:right w:type="dxa" w:w="120"/>
+            </w:tcMar>
+            <w:vAlign w:val="center"/>
+          </w:tcPr>
+          <w:p>
+            <w:r>
+              <w:rPr>
+                <w:rFonts w:ascii="Calibri" w:cs="Calibri" w:eastAsia="Calibri" w:hAnsi="Calibri"/>
+                <w:b/>
+                <w:bCs/>
+                <w:color w:val="FFFFFF"/>
+                <w:sz w:val="21"/>
+                <w:szCs w:val="21"/>
+              </w:rPr>
+              <w:t xml:space="preserve">Coberto por este guia?</w:t>
+            </w:r>
+          </w:p>
+        </w:tc>
+      </w:tr>
+      <w:tr>
+        <w:tc>
+          <w:tcPr>
+            <w:tcW w:type="dxa" w:w="1800"/>
+            <w:shd w:fill="DCE6F0" w:color="auto" w:val="clear"/>
+            <w:tcMar>
+              <w:top w:type="dxa" w:w="90"/>
+              <w:left w:type="dxa" w:w="120"/>
+              <w:bottom w:type="dxa" w:w="90"/>
+              <w:right w:type="dxa" w:w="120"/>
+            </w:tcMar>
+            <w:vAlign w:val="center"/>
+          </w:tcPr>
+          <w:p>
+            <w:r>
+              <w:rPr>
+                <w:rFonts w:ascii="Calibri" w:cs="Calibri" w:eastAsia="Calibri" w:hAnsi="Calibri"/>
+                <w:sz w:val="20"/>
+                <w:szCs w:val="20"/>
+              </w:rPr>
+              <w:t xml:space="preserve">25%</w:t>
+            </w:r>
+          </w:p>
+        </w:tc>
+        <w:tc>
+          <w:tcPr>
+            <w:tcW w:type="dxa" w:w="4800"/>
+            <w:shd w:fill="DCE6F0" w:color="auto" w:val="clear"/>
+            <w:tcMar>
+              <w:top w:type="dxa" w:w="90"/>
+              <w:left w:type="dxa" w:w="120"/>
+              <w:bottom w:type="dxa" w:w="90"/>
+              <w:right w:type="dxa" w:w="120"/>
+            </w:tcMar>
+            <w:vAlign w:val="center"/>
+          </w:tcPr>
+          <w:p>
+            <w:r>
+              <w:rPr>
+                <w:rFonts w:ascii="Calibri" w:cs="Calibri" w:eastAsia="Calibri" w:hAnsi="Calibri"/>
+                <w:sz w:val="20"/>
+                <w:szCs w:val="20"/>
+              </w:rPr>
+              <w:t xml:space="preserve">Pipeline CI</w:t>
+            </w:r>
+          </w:p>
+        </w:tc>
+        <w:tc>
+          <w:tcPr>
+            <w:tcW w:type="dxa" w:w="2426"/>
+            <w:shd w:fill="DCE6F0" w:color="auto" w:val="clear"/>
+            <w:tcMar>
+              <w:top w:type="dxa" w:w="90"/>
+              <w:left w:type="dxa" w:w="120"/>
+              <w:bottom w:type="dxa" w:w="90"/>
+              <w:right w:type="dxa" w:w="120"/>
+            </w:tcMar>
+            <w:vAlign w:val="center"/>
+          </w:tcPr>
+          <w:p>
+            <w:r>
+              <w:rPr>
+                <w:rFonts w:ascii="Calibri" w:cs="Calibri" w:eastAsia="Calibri" w:hAnsi="Calibri"/>
+                <w:sz w:val="20"/>
+                <w:szCs w:val="20"/>
+              </w:rPr>
+              <w:t xml:space="preserve">Sim — seção 5</w:t>
+            </w:r>
+          </w:p>
+        </w:tc>
+      </w:tr>
+      <w:tr>
+        <w:tc>
+          <w:tcPr>
+            <w:tcW w:type="dxa" w:w="1800"/>
+            <w:tcMar>
+              <w:top w:type="dxa" w:w="90"/>
+              <w:left w:type="dxa" w:w="120"/>
+              <w:bottom w:type="dxa" w:w="90"/>
+              <w:right w:type="dxa" w:w="120"/>
+            </w:tcMar>
+            <w:vAlign w:val="center"/>
+          </w:tcPr>
+          <w:p>
+            <w:r>
+              <w:rPr>
+                <w:rFonts w:ascii="Calibri" w:cs="Calibri" w:eastAsia="Calibri" w:hAnsi="Calibri"/>
+                <w:sz w:val="20"/>
+                <w:szCs w:val="20"/>
+              </w:rPr>
+              <w:t xml:space="preserve">20%</w:t>
+            </w:r>
+          </w:p>
+        </w:tc>
+        <w:tc>
+          <w:tcPr>
+            <w:tcW w:type="dxa" w:w="4800"/>
+            <w:tcMar>
+              <w:top w:type="dxa" w:w="90"/>
+              <w:left w:type="dxa" w:w="120"/>
+              <w:bottom w:type="dxa" w:w="90"/>
+              <w:right w:type="dxa" w:w="120"/>
+            </w:tcMar>
+            <w:vAlign w:val="center"/>
+          </w:tcPr>
+          <w:p>
+            <w:r>
+              <w:rPr>
+                <w:rFonts w:ascii="Calibri" w:cs="Calibri" w:eastAsia="Calibri" w:hAnsi="Calibri"/>
+                <w:sz w:val="20"/>
+                <w:szCs w:val="20"/>
+              </w:rPr>
+              <w:t xml:space="preserve">Containers/Compose</w:t>
+            </w:r>
+          </w:p>
+        </w:tc>
+        <w:tc>
+          <w:tcPr>
+            <w:tcW w:type="dxa" w:w="2426"/>
+            <w:tcMar>
+              <w:top w:type="dxa" w:w="90"/>
+              <w:left w:type="dxa" w:w="120"/>
+              <w:bottom w:type="dxa" w:w="90"/>
+              <w:right w:type="dxa" w:w="120"/>
+            </w:tcMar>
+            <w:vAlign w:val="center"/>
+          </w:tcPr>
+          <w:p>
+            <w:r>
+              <w:rPr>
+                <w:rFonts w:ascii="Calibri" w:cs="Calibri" w:eastAsia="Calibri" w:hAnsi="Calibri"/>
+                <w:sz w:val="20"/>
+                <w:szCs w:val="20"/>
+              </w:rPr>
+              <w:t xml:space="preserve">Sim — seções 3, 4 e 7</w:t>
+            </w:r>
+          </w:p>
+        </w:tc>
+      </w:tr>
+      <w:tr>
+        <w:tc>
+          <w:tcPr>
+            <w:tcW w:type="dxa" w:w="1800"/>
+            <w:shd w:fill="DCE6F0" w:color="auto" w:val="clear"/>
+            <w:tcMar>
+              <w:top w:type="dxa" w:w="90"/>
+              <w:left w:type="dxa" w:w="120"/>
+              <w:bottom w:type="dxa" w:w="90"/>
+              <w:right w:type="dxa" w:w="120"/>
+            </w:tcMar>
+            <w:vAlign w:val="center"/>
+          </w:tcPr>
+          <w:p>
+            <w:r>
+              <w:rPr>
+                <w:rFonts w:ascii="Calibri" w:cs="Calibri" w:eastAsia="Calibri" w:hAnsi="Calibri"/>
+                <w:sz w:val="20"/>
+                <w:szCs w:val="20"/>
+              </w:rPr>
+              <w:t xml:space="preserve">25%</w:t>
+            </w:r>
+          </w:p>
+        </w:tc>
+        <w:tc>
+          <w:tcPr>
+            <w:tcW w:type="dxa" w:w="4800"/>
+            <w:shd w:fill="DCE6F0" w:color="auto" w:val="clear"/>
+            <w:tcMar>
+              <w:top w:type="dxa" w:w="90"/>
+              <w:left w:type="dxa" w:w="120"/>
+              <w:bottom w:type="dxa" w:w="90"/>
+              <w:right w:type="dxa" w:w="120"/>
+            </w:tcMar>
+            <w:vAlign w:val="center"/>
+          </w:tcPr>
+          <w:p>
+            <w:r>
+              <w:rPr>
+                <w:rFonts w:ascii="Calibri" w:cs="Calibri" w:eastAsia="Calibri" w:hAnsi="Calibri"/>
+                <w:sz w:val="20"/>
+                <w:szCs w:val="20"/>
+              </w:rPr>
+              <w:t xml:space="preserve">Projeto funcional</w:t>
+            </w:r>
+          </w:p>
+        </w:tc>
+        <w:tc>
+          <w:tcPr>
+            <w:tcW w:type="dxa" w:w="2426"/>
+            <w:shd w:fill="DCE6F0" w:color="auto" w:val="clear"/>
+            <w:tcMar>
+              <w:top w:type="dxa" w:w="90"/>
+              <w:left w:type="dxa" w:w="120"/>
+              <w:bottom w:type="dxa" w:w="90"/>
+              <w:right w:type="dxa" w:w="120"/>
+            </w:tcMar>
+            <w:vAlign w:val="center"/>
+          </w:tcPr>
+          <w:p>
+            <w:r>
+              <w:rPr>
+                <w:rFonts w:ascii="Calibri" w:cs="Calibri" w:eastAsia="Calibri" w:hAnsi="Calibri"/>
+                <w:sz w:val="20"/>
+                <w:szCs w:val="20"/>
+              </w:rPr>
+              <w:t xml:space="preserve">Não — ver Enunciado do Projeto Integrador</w:t>
+            </w:r>
+          </w:p>
+        </w:tc>
+      </w:tr>
+      <w:tr>
+        <w:tc>
+          <w:tcPr>
+            <w:tcW w:type="dxa" w:w="1800"/>
+            <w:tcMar>
+              <w:top w:type="dxa" w:w="90"/>
+              <w:left w:type="dxa" w:w="120"/>
+              <w:bottom w:type="dxa" w:w="90"/>
+              <w:right w:type="dxa" w:w="120"/>
+            </w:tcMar>
+            <w:vAlign w:val="center"/>
+          </w:tcPr>
+          <w:p>
+            <w:r>
+              <w:rPr>
+                <w:rFonts w:ascii="Calibri" w:cs="Calibri" w:eastAsia="Calibri" w:hAnsi="Calibri"/>
+                <w:sz w:val="20"/>
+                <w:szCs w:val="20"/>
+              </w:rPr>
+              <w:t xml:space="preserve">15%</w:t>
+            </w:r>
+          </w:p>
+        </w:tc>
+        <w:tc>
+          <w:tcPr>
+            <w:tcW w:type="dxa" w:w="4800"/>
+            <w:tcMar>
+              <w:top w:type="dxa" w:w="90"/>
+              <w:left w:type="dxa" w:w="120"/>
+              <w:bottom w:type="dxa" w:w="90"/>
+              <w:right w:type="dxa" w:w="120"/>
+            </w:tcMar>
+            <w:vAlign w:val="center"/>
+          </w:tcPr>
+          <w:p>
+            <w:r>
+              <w:rPr>
+                <w:rFonts w:ascii="Calibri" w:cs="Calibri" w:eastAsia="Calibri" w:hAnsi="Calibri"/>
+                <w:sz w:val="20"/>
+                <w:szCs w:val="20"/>
+              </w:rPr>
+              <w:t xml:space="preserve">Entrega e operação</w:t>
+            </w:r>
+          </w:p>
+        </w:tc>
+        <w:tc>
+          <w:tcPr>
+            <w:tcW w:type="dxa" w:w="2426"/>
+            <w:tcMar>
+              <w:top w:type="dxa" w:w="90"/>
+              <w:left w:type="dxa" w:w="120"/>
+              <w:bottom w:type="dxa" w:w="90"/>
+              <w:right w:type="dxa" w:w="120"/>
+            </w:tcMar>
+            <w:vAlign w:val="center"/>
+          </w:tcPr>
+          <w:p>
+            <w:r>
+              <w:rPr>
+                <w:rFonts w:ascii="Calibri" w:cs="Calibri" w:eastAsia="Calibri" w:hAnsi="Calibri"/>
+                <w:sz w:val="20"/>
+                <w:szCs w:val="20"/>
+              </w:rPr>
+              <w:t xml:space="preserve">Não — release notes e rollback, ver Encontro 5</w:t>
+            </w:r>
+          </w:p>
+        </w:tc>
+      </w:tr>
+      <w:tr>
+        <w:tc>
+          <w:tcPr>
+            <w:tcW w:type="dxa" w:w="1800"/>
+            <w:shd w:fill="DCE6F0" w:color="auto" w:val="clear"/>
+            <w:tcMar>
+              <w:top w:type="dxa" w:w="90"/>
+              <w:left w:type="dxa" w:w="120"/>
+              <w:bottom w:type="dxa" w:w="90"/>
+              <w:right w:type="dxa" w:w="120"/>
+            </w:tcMar>
+            <w:vAlign w:val="center"/>
+          </w:tcPr>
+          <w:p>
+            <w:r>
+              <w:rPr>
+                <w:rFonts w:ascii="Calibri" w:cs="Calibri" w:eastAsia="Calibri" w:hAnsi="Calibri"/>
+                <w:sz w:val="20"/>
+                <w:szCs w:val="20"/>
+              </w:rPr>
+              <w:t xml:space="preserve">10%</w:t>
+            </w:r>
+          </w:p>
+        </w:tc>
+        <w:tc>
+          <w:tcPr>
+            <w:tcW w:type="dxa" w:w="4800"/>
+            <w:shd w:fill="DCE6F0" w:color="auto" w:val="clear"/>
+            <w:tcMar>
+              <w:top w:type="dxa" w:w="90"/>
+              <w:left w:type="dxa" w:w="120"/>
+              <w:bottom w:type="dxa" w:w="90"/>
+              <w:right w:type="dxa" w:w="120"/>
+            </w:tcMar>
+            <w:vAlign w:val="center"/>
+          </w:tcPr>
+          <w:p>
+            <w:r>
+              <w:rPr>
+                <w:rFonts w:ascii="Calibri" w:cs="Calibri" w:eastAsia="Calibri" w:hAnsi="Calibri"/>
+                <w:sz w:val="20"/>
+                <w:szCs w:val="20"/>
+              </w:rPr>
+              <w:t xml:space="preserve">Diagnóstico DevOps</w:t>
+            </w:r>
+          </w:p>
+        </w:tc>
+        <w:tc>
+          <w:tcPr>
+            <w:tcW w:type="dxa" w:w="2426"/>
+            <w:shd w:fill="DCE6F0" w:color="auto" w:val="clear"/>
+            <w:tcMar>
+              <w:top w:type="dxa" w:w="90"/>
+              <w:left w:type="dxa" w:w="120"/>
+              <w:bottom w:type="dxa" w:w="90"/>
+              <w:right w:type="dxa" w:w="120"/>
+            </w:tcMar>
+            <w:vAlign w:val="center"/>
+          </w:tcPr>
+          <w:p>
+            <w:r>
+              <w:rPr>
+                <w:rFonts w:ascii="Calibri" w:cs="Calibri" w:eastAsia="Calibri" w:hAnsi="Calibri"/>
+                <w:sz w:val="20"/>
+                <w:szCs w:val="20"/>
+              </w:rPr>
+              <w:t xml:space="preserve">Não — ver Encontro 1</w:t>
+            </w:r>
+          </w:p>
+        </w:tc>
+      </w:tr>
+      <w:tr>
+        <w:tc>
+          <w:tcPr>
+            <w:tcW w:type="dxa" w:w="1800"/>
+            <w:tcMar>
+              <w:top w:type="dxa" w:w="90"/>
+              <w:left w:type="dxa" w:w="120"/>
+              <w:bottom w:type="dxa" w:w="90"/>
+              <w:right w:type="dxa" w:w="120"/>
+            </w:tcMar>
+            <w:vAlign w:val="center"/>
+          </w:tcPr>
+          <w:p>
+            <w:r>
+              <w:rPr>
+                <w:rFonts w:ascii="Calibri" w:cs="Calibri" w:eastAsia="Calibri" w:hAnsi="Calibri"/>
+                <w:sz w:val="20"/>
+                <w:szCs w:val="20"/>
+              </w:rPr>
+              <w:t xml:space="preserve">5%</w:t>
+            </w:r>
+          </w:p>
+        </w:tc>
+        <w:tc>
+          <w:tcPr>
+            <w:tcW w:type="dxa" w:w="4800"/>
+            <w:tcMar>
+              <w:top w:type="dxa" w:w="90"/>
+              <w:left w:type="dxa" w:w="120"/>
+              <w:bottom w:type="dxa" w:w="90"/>
+              <w:right w:type="dxa" w:w="120"/>
+            </w:tcMar>
+            <w:vAlign w:val="center"/>
+          </w:tcPr>
+          <w:p>
+            <w:r>
+              <w:rPr>
+                <w:rFonts w:ascii="Calibri" w:cs="Calibri" w:eastAsia="Calibri" w:hAnsi="Calibri"/>
+                <w:sz w:val="20"/>
+                <w:szCs w:val="20"/>
+              </w:rPr>
+              <w:t xml:space="preserve">Apresentação final</w:t>
+            </w:r>
+          </w:p>
+        </w:tc>
+        <w:tc>
+          <w:tcPr>
+            <w:tcW w:type="dxa" w:w="2426"/>
+            <w:tcMar>
+              <w:top w:type="dxa" w:w="90"/>
+              <w:left w:type="dxa" w:w="120"/>
+              <w:bottom w:type="dxa" w:w="90"/>
+              <w:right w:type="dxa" w:w="120"/>
+            </w:tcMar>
+            <w:vAlign w:val="center"/>
+          </w:tcPr>
+          <w:p>
+            <w:r>
+              <w:rPr>
+                <w:rFonts w:ascii="Calibri" w:cs="Calibri" w:eastAsia="Calibri" w:hAnsi="Calibri"/>
+                <w:sz w:val="20"/>
+                <w:szCs w:val="20"/>
+              </w:rPr>
+              <w:t xml:space="preserve">Não — ver Encontro 6</w:t>
+            </w:r>
+          </w:p>
+        </w:tc>
+      </w:tr>
+    </w:tbl>
+    <w:p>
+      <w:pPr>
+        <w:spacing w:after="140"/>
+      </w:pPr>
+    </w:p>
+    <w:p>
+      <w:pPr>
+        <w:spacing w:after="160"/>
+      </w:pPr>
+      <w:r>
+        <w:rPr>
+          <w:rFonts w:ascii="Calibri" w:cs="Calibri" w:eastAsia="Calibri" w:hAnsi="Calibri"/>
+          <w:b/>
+          <w:bCs/>
+          <w:sz w:val="22"/>
+          <w:szCs w:val="22"/>
+        </w:rPr>
+        <w:t xml:space="preserve">45%</w:t>
+      </w:r>
+      <w:r>
+        <w:rPr>
+          <w:rFonts w:ascii="Calibri" w:cs="Calibri" w:eastAsia="Calibri" w:hAnsi="Calibri"/>
+          <w:sz w:val="22"/>
+          <w:szCs w:val="22"/>
+        </w:rPr>
+        <w:t xml:space="preserve"> (Pipeline CI 25% + Containers/Compose 20%) </w:t>
+      </w:r>
+      <w:r>
+        <w:rPr>
+          <w:rFonts w:ascii="Calibri" w:cs="Calibri" w:eastAsia="Calibri" w:hAnsi="Calibri"/>
+          <w:sz w:val="22"/>
+          <w:szCs w:val="22"/>
+        </w:rPr>
+        <w:t xml:space="preserve">é a parte da nota que este guia cobre. </w:t>
+      </w:r>
+      <w:r>
+        <w:rPr>
+          <w:rFonts w:ascii="Calibri" w:cs="Calibri" w:eastAsia="Calibri" w:hAnsi="Calibri"/>
+          <w:b/>
+          <w:bCs/>
+          <w:sz w:val="22"/>
+          <w:szCs w:val="22"/>
+        </w:rPr>
+        <w:t xml:space="preserve">55%</w:t>
+      </w:r>
+      <w:r>
+        <w:rPr>
+          <w:rFonts w:ascii="Calibri" w:cs="Calibri" w:eastAsia="Calibri" w:hAnsi="Calibri"/>
+          <w:sz w:val="22"/>
+          <w:szCs w:val="22"/>
+        </w:rPr>
+        <w:t xml:space="preserve"> (Projeto funcional 25% + Entrega e operação 15% + Diagnóstico DevOps 10% + Apresentação final 5%) </w:t>
+      </w:r>
+      <w:r>
+        <w:rPr>
+          <w:rFonts w:ascii="Calibri" w:cs="Calibri" w:eastAsia="Calibri" w:hAnsi="Calibri"/>
+          <w:sz w:val="22"/>
+          <w:szCs w:val="22"/>
+        </w:rPr>
+        <w:t xml:space="preserve">vem dos demais critérios, tratados no Enunciado do Projeto Integrador e nos outros encontros — não é assunto deste documento. </w:t>
+      </w:r>
+      <w:r>
+        <w:rPr>
+          <w:rFonts w:ascii="Calibri" w:cs="Calibri" w:eastAsia="Calibri" w:hAnsi="Calibri"/>
+          <w:b/>
+          <w:bCs/>
+          <w:sz w:val="22"/>
+          <w:szCs w:val="22"/>
+        </w:rPr>
+        <w:t xml:space="preserve">45% + 55% = 100%</w:t>
+      </w:r>
+      <w:r>
+        <w:rPr>
+          <w:rFonts w:ascii="Calibri" w:cs="Calibri" w:eastAsia="Calibri" w:hAnsi="Calibri"/>
+          <w:sz w:val="22"/>
+          <w:szCs w:val="22"/>
+        </w:rPr>
+        <w:t xml:space="preserve"> — a soma bate com os 6 critérios do Plano de Ensino, sem nenhum peso oficial alterado.</w:t>
+      </w:r>
+    </w:p>
     <w:p>
       <w:pPr>
         <w:pStyle w:val="Heading1"/>

</xml_diff>